<commit_message>
Añade descripción y custodio en el historial de las partes y piezas y aade SPEC de mtto tecnológico
</commit_message>
<xml_diff>
--- a/SPEC_Sistema_RRHH.docx
+++ b/SPEC_Sistema_RRHH.docx
@@ -93,12 +93,11 @@
         <w:jc w:val="both"/>
       </w:pPr>
       <w:r>
-        <w:t>Versión: 1.0</w:t>
+        <w:t>Versión: 1.1</w:t>
+        <w:br/>
+        <w:t>Fecha: 20 de julio de 2026</w:t>
       </w:r>
-      <w:r>
-        <w:br/>
-        <w:t>Fecha: 11 de June de 2026</w:t>
-      </w:r>
+      <w:r/>
     </w:p>
     <w:p>
       <w:pPr>
@@ -149,11 +148,9 @@
         <w:jc w:val="both"/>
       </w:pPr>
       <w:r>
-        <w:t>El Sistema Integrado de Gestión Institucional es una aplicación web desarrollada a medida para el Consejo de Comunicación del Ecuador. Centraliza la administración de los procesos operativos institucionales en tres módulos p</w:t>
+        <w:t>El Sistema Integrado de Gestión Institucional es una aplicación web desarrollada a medida para el Consejo de Comunicación del Ecuador. Centraliza la administración de los procesos operativos institucionales en cuatro módulos principales: Talento Humano, Adquisiciones/Bienes, Transportes y Tecnología (inventario y mantenimiento de equipos), complementados con los módulos de Nómina y Administración.</w:t>
       </w:r>
-      <w:r>
-        <w:t>rincipales: Talento Humano, Adquisiciones/Bienes y Transportes, complementados con los módulos de Nómina y Administración.</w:t>
-      </w:r>
+      <w:r/>
     </w:p>
     <w:p>
       <w:pPr>
@@ -296,6 +293,17 @@
     </w:p>
     <w:p>
       <w:pPr>
+        <w:pStyle w:val="Listaconvietas"/>
+      </w:pPr>
+      <w:r>
+        <w:rPr>
+          <w:sz w:val="21"/>
+        </w:rPr>
+        <w:t>Controlar el inventario de equipos tecnológicos institucionales: custodia por empleado con trazabilidad histórica, mantenimiento preventivo anual (interno y por proveedor externo) y trazabilidad de piezas/repuestos instaladas.</w:t>
+      </w:r>
+    </w:p>
+    <w:p>
+      <w:pPr>
         <w:pStyle w:val="Ttulo2"/>
         <w:jc w:val="both"/>
       </w:pPr>
@@ -4108,6 +4116,259 @@
     </w:p>
     <w:p>
       <w:pPr>
+        <w:pStyle w:val="Ttulo2"/>
+      </w:pPr>
+      <w:r>
+        <w:t>4.6 Módulo Inventario Tecnológico</w:t>
+      </w:r>
+    </w:p>
+    <w:p>
+      <w:pPr/>
+      <w:r>
+        <w:rPr>
+          <w:sz w:val="21"/>
+        </w:rPr>
+        <w:t>Gestiona el inventario de equipos tecnológicos institucionales (computadoras, laptops, impresoras, infraestructura, etc.) de la Dirección de Tecnología: a quién se le asigna cada equipo con historial completo de custodia, el mantenimiento preventivo anual (interno con checklist de 10 puntos, o externo por proveedor cubriendo toda una categoría bajo una orden de compra) y la trazabilidad de las piezas/repuestos instaladas en cada equipo.</w:t>
+      </w:r>
+    </w:p>
+    <w:p>
+      <w:pPr>
+        <w:pStyle w:val="Ttulo3"/>
+      </w:pPr>
+      <w:r>
+        <w:t>Submódulos</w:t>
+      </w:r>
+    </w:p>
+    <w:tbl>
+      <w:tblPr>
+        <w:tblStyle w:val="Tablaconcuadrcula"/>
+        <w:tblW w:type="auto" w:w="0"/>
+        <w:tblLook w:firstColumn="1" w:firstRow="1" w:lastColumn="0" w:lastRow="0" w:noHBand="0" w:noVBand="1" w:val="04A0"/>
+      </w:tblPr>
+      <w:tblGrid>
+        <w:gridCol w:w="4561"/>
+        <w:gridCol w:w="4561"/>
+      </w:tblGrid>
+      <w:tr>
+        <w:tc>
+          <w:tcPr>
+            <w:tcW w:type="dxa" w:w="4561"/>
+            <w:shd w:val="clear" w:color="auto" w:fill="0B5547"/>
+          </w:tcPr>
+          <w:p>
+            <w:r>
+              <w:rPr>
+                <w:b/>
+                <w:color w:val="FFFFFF"/>
+                <w:sz w:val="19"/>
+              </w:rPr>
+              <w:t>Submódulo</w:t>
+            </w:r>
+          </w:p>
+        </w:tc>
+        <w:tc>
+          <w:tcPr>
+            <w:tcW w:type="dxa" w:w="4561"/>
+            <w:shd w:val="clear" w:color="auto" w:fill="0B5547"/>
+          </w:tcPr>
+          <w:p>
+            <w:r>
+              <w:rPr>
+                <w:b/>
+                <w:color w:val="FFFFFF"/>
+                <w:sz w:val="19"/>
+              </w:rPr>
+              <w:t>Descripción</w:t>
+            </w:r>
+          </w:p>
+        </w:tc>
+      </w:tr>
+      <w:tr>
+        <w:tc>
+          <w:tcPr>
+            <w:tcW w:type="dxa" w:w="4561"/>
+          </w:tcPr>
+          <w:p>
+            <w:r>
+              <w:rPr>
+                <w:b/>
+                <w:sz w:val="19"/>
+              </w:rPr>
+              <w:t>Inventario de Equipos</w:t>
+            </w:r>
+          </w:p>
+        </w:tc>
+        <w:tc>
+          <w:tcPr>
+            <w:tcW w:type="dxa" w:w="4561"/>
+          </w:tcPr>
+          <w:p>
+            <w:r>
+              <w:rPr>
+                <w:b w:val="0"/>
+                <w:sz w:val="19"/>
+              </w:rPr>
+              <w:t>Catálogo de equipos por tipo, con código de bien, marca, modelo, serie, condición, fecha de ingreso y vida útil. Alerta de vida útil vencida. Carga masiva por CSV.</w:t>
+            </w:r>
+          </w:p>
+        </w:tc>
+      </w:tr>
+      <w:tr>
+        <w:tc>
+          <w:tcPr>
+            <w:tcW w:type="dxa" w:w="4561"/>
+          </w:tcPr>
+          <w:p>
+            <w:r>
+              <w:rPr>
+                <w:b/>
+                <w:sz w:val="19"/>
+              </w:rPr>
+              <w:t>Custodia de Equipos</w:t>
+            </w:r>
+          </w:p>
+        </w:tc>
+        <w:tc>
+          <w:tcPr>
+            <w:tcW w:type="dxa" w:w="4561"/>
+          </w:tcPr>
+          <w:p>
+            <w:r>
+              <w:rPr>
+                <w:b w:val="0"/>
+                <w:sz w:val="19"/>
+              </w:rPr>
+              <w:t>Asignación y devolución de equipos a empleados con historial completo (línea de tiempo) de todos los custodios que ha tenido cada equipo.</w:t>
+            </w:r>
+          </w:p>
+        </w:tc>
+      </w:tr>
+      <w:tr>
+        <w:tc>
+          <w:tcPr>
+            <w:tcW w:type="dxa" w:w="4561"/>
+          </w:tcPr>
+          <w:p>
+            <w:r>
+              <w:rPr>
+                <w:b/>
+                <w:sz w:val="19"/>
+              </w:rPr>
+              <w:t>Mantenimiento Preventivo</w:t>
+            </w:r>
+          </w:p>
+        </w:tc>
+        <w:tc>
+          <w:tcPr>
+            <w:tcW w:type="dxa" w:w="4561"/>
+          </w:tcPr>
+          <w:p>
+            <w:r>
+              <w:rPr>
+                <w:b w:val="0"/>
+                <w:sz w:val="19"/>
+              </w:rPr>
+              <w:t>Ejecución anual (una vez por equipo por año) con checklist de 10 puntos reales del formulario físico de TI. Genera acta en PDF con firmas de técnico y custodio.</w:t>
+            </w:r>
+          </w:p>
+        </w:tc>
+      </w:tr>
+      <w:tr>
+        <w:tc>
+          <w:tcPr>
+            <w:tcW w:type="dxa" w:w="4561"/>
+          </w:tcPr>
+          <w:p>
+            <w:r>
+              <w:rPr>
+                <w:b/>
+                <w:sz w:val="19"/>
+              </w:rPr>
+              <w:t>Mantenimiento Externo</w:t>
+            </w:r>
+          </w:p>
+        </w:tc>
+        <w:tc>
+          <w:tcPr>
+            <w:tcW w:type="dxa" w:w="4561"/>
+          </w:tcPr>
+          <w:p>
+            <w:r>
+              <w:rPr>
+                <w:b w:val="0"/>
+                <w:sz w:val="19"/>
+              </w:rPr>
+              <w:t>Registro masivo por categoría de equipo cuando lo ejecuta un proveedor externo bajo una orden de compra — cubre todos los equipos de esa categoría en un solo lote, con acta agrupada en PDF.</w:t>
+            </w:r>
+          </w:p>
+        </w:tc>
+      </w:tr>
+      <w:tr>
+        <w:tc>
+          <w:tcPr>
+            <w:tcW w:type="dxa" w:w="4561"/>
+          </w:tcPr>
+          <w:p>
+            <w:r>
+              <w:rPr>
+                <w:b/>
+                <w:sz w:val="19"/>
+              </w:rPr>
+              <w:t>Piezas y Repuestos</w:t>
+            </w:r>
+          </w:p>
+        </w:tc>
+        <w:tc>
+          <w:tcPr>
+            <w:tcW w:type="dxa" w:w="4561"/>
+          </w:tcPr>
+          <w:p>
+            <w:r>
+              <w:rPr>
+                <w:b w:val="0"/>
+                <w:sz w:val="19"/>
+              </w:rPr>
+              <w:t>Catálogo de piezas/repuestos con fecha de entrega (recibidas de la Unidad de Bienes/Dirección Administrativa, que las codifica). Trazabilidad de en qué equipo está instalada cada pieza, con historial de movimientos.</w:t>
+            </w:r>
+          </w:p>
+        </w:tc>
+      </w:tr>
+      <w:tr>
+        <w:tc>
+          <w:tcPr>
+            <w:tcW w:type="dxa" w:w="4561"/>
+          </w:tcPr>
+          <w:p>
+            <w:r>
+              <w:rPr>
+                <w:b/>
+                <w:sz w:val="19"/>
+              </w:rPr>
+              <w:t>Tipos de Equipo / Actividades de Mantenimiento</w:t>
+            </w:r>
+          </w:p>
+        </w:tc>
+        <w:tc>
+          <w:tcPr>
+            <w:tcW w:type="dxa" w:w="4561"/>
+          </w:tcPr>
+          <w:p>
+            <w:r>
+              <w:rPr>
+                <w:b w:val="0"/>
+                <w:sz w:val="19"/>
+              </w:rPr>
+              <w:t>Catálogos editables: categorías de equipo y los ítems del checklist de mantenimiento.</w:t>
+            </w:r>
+          </w:p>
+        </w:tc>
+      </w:tr>
+    </w:tbl>
+    <w:p>
+      <w:pPr/>
+    </w:p>
+    <w:p>
+      <w:pPr>
         <w:pStyle w:val="Ttulo1"/>
         <w:jc w:val="both"/>
       </w:pPr>
@@ -4506,6 +4767,36 @@
                 <w:sz w:val="19"/>
               </w:rPr>
               <w:t>Dashboard personal, marcación de asistencia, solicitud de permisos y vacaciones, horas extras propias.</w:t>
+            </w:r>
+          </w:p>
+        </w:tc>
+      </w:tr>
+      <w:tr>
+        <w:tc>
+          <w:tcPr>
+            <w:tcW w:type="dxa" w:w="4561"/>
+          </w:tcPr>
+          <w:p>
+            <w:r>
+              <w:rPr>
+                <w:b/>
+                <w:sz w:val="19"/>
+              </w:rPr>
+              <w:t>TECNOLOGIA</w:t>
+            </w:r>
+          </w:p>
+        </w:tc>
+        <w:tc>
+          <w:tcPr>
+            <w:tcW w:type="dxa" w:w="4561"/>
+          </w:tcPr>
+          <w:p>
+            <w:r>
+              <w:rPr>
+                <w:b w:val="0"/>
+                <w:sz w:val="19"/>
+              </w:rPr>
+              <w:t>Módulo de Inventario Tecnológico completo: equipos, custodia, mantenimiento (interno y externo), piezas y repuestos.</w:t>
             </w:r>
           </w:p>
         </w:tc>
@@ -4994,6 +5285,36 @@
                 <w:sz w:val="19"/>
               </w:rPr>
               <w:t>LOGIN, LOGOUT, LOGIN_FALLIDO</w:t>
+            </w:r>
+          </w:p>
+        </w:tc>
+      </w:tr>
+      <w:tr>
+        <w:tc>
+          <w:tcPr>
+            <w:tcW w:type="dxa" w:w="4561"/>
+          </w:tcPr>
+          <w:p>
+            <w:r>
+              <w:rPr>
+                <w:b/>
+                <w:sz w:val="19"/>
+              </w:rPr>
+              <w:t>Tecnología</w:t>
+            </w:r>
+          </w:p>
+        </w:tc>
+        <w:tc>
+          <w:tcPr>
+            <w:tcW w:type="dxa" w:w="4561"/>
+          </w:tcPr>
+          <w:p>
+            <w:r>
+              <w:rPr>
+                <w:b w:val="0"/>
+                <w:sz w:val="19"/>
+              </w:rPr>
+              <w:t>ASIGNAR, DEVOLVER, DAR_DE_BAJA, MARCAR_DISPONIBLE, REGISTRAR_MANTENIMIENTO, REGISTRAR_MANTENIMIENTO_EXTERNO (equipos); INSTALAR, RETIRAR, DAR_DE_BAJA, MARCAR_DISPONIBLE (piezas)</w:t>
             </w:r>
           </w:p>
         </w:tc>
@@ -5805,6 +6126,66 @@
           </w:p>
         </w:tc>
       </w:tr>
+      <w:tr>
+        <w:tc>
+          <w:tcPr>
+            <w:tcW w:type="dxa" w:w="4561"/>
+          </w:tcPr>
+          <w:p>
+            <w:r>
+              <w:rPr>
+                <w:b/>
+                <w:sz w:val="19"/>
+              </w:rPr>
+              <w:t>Acta de Mantenimiento (TI)</w:t>
+            </w:r>
+          </w:p>
+        </w:tc>
+        <w:tc>
+          <w:tcPr>
+            <w:tcW w:type="dxa" w:w="4561"/>
+          </w:tcPr>
+          <w:p>
+            <w:r>
+              <w:rPr>
+                <w:b w:val="0"/>
+                <w:sz w:val="19"/>
+              </w:rPr>
+              <w:t>Checklist de 10 puntos con firmas de técnico y custodio del equipo. Portrait A4.</w:t>
+            </w:r>
+          </w:p>
+        </w:tc>
+      </w:tr>
+      <w:tr>
+        <w:tc>
+          <w:tcPr>
+            <w:tcW w:type="dxa" w:w="4561"/>
+          </w:tcPr>
+          <w:p>
+            <w:r>
+              <w:rPr>
+                <w:b/>
+                <w:sz w:val="19"/>
+              </w:rPr>
+              <w:t>Acta de Mantenimiento Externo (TI)</w:t>
+            </w:r>
+          </w:p>
+        </w:tc>
+        <w:tc>
+          <w:tcPr>
+            <w:tcW w:type="dxa" w:w="4561"/>
+          </w:tcPr>
+          <w:p>
+            <w:r>
+              <w:rPr>
+                <w:b w:val="0"/>
+                <w:sz w:val="19"/>
+              </w:rPr>
+              <w:t>Acta agrupada por lote de proveedor: datos del proveedor/proceso/orden de compra + tabla de equipos cubiertos. Portrait A4.</w:t>
+            </w:r>
+          </w:p>
+        </w:tc>
+      </w:tr>
     </w:tbl>
     <w:p>
       <w:pPr>
@@ -6977,6 +7358,126 @@
                 <w:sz w:val="19"/>
               </w:rPr>
               <w:t>Relojes biométricos registrados.</w:t>
+            </w:r>
+          </w:p>
+        </w:tc>
+      </w:tr>
+      <w:tr>
+        <w:tc>
+          <w:tcPr>
+            <w:tcW w:type="dxa" w:w="4561"/>
+          </w:tcPr>
+          <w:p>
+            <w:r>
+              <w:rPr>
+                <w:b/>
+                <w:sz w:val="19"/>
+              </w:rPr>
+              <w:t>dbo.ti_equipo</w:t>
+            </w:r>
+          </w:p>
+        </w:tc>
+        <w:tc>
+          <w:tcPr>
+            <w:tcW w:type="dxa" w:w="4561"/>
+          </w:tcPr>
+          <w:p>
+            <w:r>
+              <w:rPr>
+                <w:b w:val="0"/>
+                <w:sz w:val="19"/>
+              </w:rPr>
+              <w:t>Inventario de equipos tecnológicos. Estado DISPONIBLE/ASIGNADO/DAÑADO/DE_BAJA. Vida útil vencida calculada.</w:t>
+            </w:r>
+          </w:p>
+        </w:tc>
+      </w:tr>
+      <w:tr>
+        <w:tc>
+          <w:tcPr>
+            <w:tcW w:type="dxa" w:w="4561"/>
+          </w:tcPr>
+          <w:p>
+            <w:r>
+              <w:rPr>
+                <w:b/>
+                <w:sz w:val="19"/>
+              </w:rPr>
+              <w:t>dbo.ti_asignacion</w:t>
+            </w:r>
+          </w:p>
+        </w:tc>
+        <w:tc>
+          <w:tcPr>
+            <w:tcW w:type="dxa" w:w="4561"/>
+          </w:tcPr>
+          <w:p>
+            <w:r>
+              <w:rPr>
+                <w:b w:val="0"/>
+                <w:sz w:val="19"/>
+              </w:rPr>
+              <w:t>Historial de custodia de equipos por empleado (una asignación activa por equipo a la vez).</w:t>
+            </w:r>
+          </w:p>
+        </w:tc>
+      </w:tr>
+      <w:tr>
+        <w:tc>
+          <w:tcPr>
+            <w:tcW w:type="dxa" w:w="4561"/>
+          </w:tcPr>
+          <w:p>
+            <w:r>
+              <w:rPr>
+                <w:b/>
+                <w:sz w:val="19"/>
+              </w:rPr>
+              <w:t>dbo.ti_mantenimiento / ti_mantenimiento_detalle</w:t>
+            </w:r>
+          </w:p>
+        </w:tc>
+        <w:tc>
+          <w:tcPr>
+            <w:tcW w:type="dxa" w:w="4561"/>
+          </w:tcPr>
+          <w:p>
+            <w:r>
+              <w:rPr>
+                <w:b w:val="0"/>
+                <w:sz w:val="19"/>
+              </w:rPr>
+              <w:t>Ejecución anual de mantenimiento preventivo por equipo, interno (con checklist) o externo por proveedor (por lote).</w:t>
+            </w:r>
+          </w:p>
+        </w:tc>
+      </w:tr>
+      <w:tr>
+        <w:tc>
+          <w:tcPr>
+            <w:tcW w:type="dxa" w:w="4561"/>
+          </w:tcPr>
+          <w:p>
+            <w:r>
+              <w:rPr>
+                <w:b/>
+                <w:sz w:val="19"/>
+              </w:rPr>
+              <w:t>dbo.ti_pieza / ti_pieza_movimiento</w:t>
+            </w:r>
+          </w:p>
+        </w:tc>
+        <w:tc>
+          <w:tcPr>
+            <w:tcW w:type="dxa" w:w="4561"/>
+          </w:tcPr>
+          <w:p>
+            <w:r>
+              <w:rPr>
+                <w:b w:val="0"/>
+                <w:sz w:val="19"/>
+              </w:rPr>
+              <w:t>Catálogo de piezas/repuestos y trazabilidad de instalación/retiro en equipos.</w:t>
             </w:r>
           </w:p>
         </w:tc>
@@ -8316,7 +8817,9 @@
           <w:sz w:val="18"/>
         </w:rPr>
         <w:br/>
-        <w:t>Consej</w:t>
+        <w:t>Consejo de Comunicación — Documento Confidencial de Uso Interno</w:t>
+        <w:br/>
+        <w:t>Generado el 20/07/2026</w:t>
       </w:r>
       <w:r>
         <w:rPr>
@@ -8324,7 +8827,6 @@
           <w:color w:val="888888"/>
           <w:sz w:val="18"/>
         </w:rPr>
-        <w:t>o de Comunicación — Documento Confidencial de Uso Interno</w:t>
       </w:r>
       <w:r>
         <w:rPr>
@@ -8332,8 +8834,6 @@
           <w:color w:val="888888"/>
           <w:sz w:val="18"/>
         </w:rPr>
-        <w:br/>
-        <w:t>Generado el 11/06/2026</w:t>
       </w:r>
     </w:p>
     <w:p>

</xml_diff>